<commit_message>
Clean up title page - remove info table, keep GitHub link
</commit_message>
<xml_diff>
--- a/project_report.docx
+++ b/project_report.docx
@@ -47,6 +47,48 @@
           <w:szCs w:val="24"/>
         </w:rPr>
         <w:t xml:space="preserve">AI for Engineers — Group Assignment</w:t>
+      </w:r>
+    </w:p>
+    <w:p>
+      <w:pPr>
+        <w:spacing w:after="60"/>
+        <w:jc w:val="center"/>
+      </w:pPr>
+      <w:r>
+        <w:rPr>
+          <w:rFonts w:ascii="Arial" w:cs="Arial" w:eastAsia="Arial" w:hAnsi="Arial"/>
+          <w:color w:val="2563EB"/>
+          <w:sz w:val="20"/>
+          <w:szCs w:val="20"/>
+        </w:rPr>
+        <w:t xml:space="preserve">github.com/AdithyaReddyGeeda/Multimodal-Crime-Incident-Report-Analyzer</w:t>
+      </w:r>
+    </w:p>
+    <w:p>
+      <w:pPr>
+        <w:spacing w:after="120"/>
+      </w:pPr>
+    </w:p>
+    <w:p>
+      <w:pPr>
+        <w:spacing w:after="120"/>
+      </w:pPr>
+    </w:p>
+    <w:p>
+      <w:pPr>
+        <w:spacing w:after="120"/>
+        <w:jc w:val="center"/>
+      </w:pPr>
+      <w:r>
+        <w:rPr>
+          <w:rFonts w:ascii="Arial" w:cs="Arial" w:eastAsia="Arial" w:hAnsi="Arial"/>
+          <w:b/>
+          <w:bCs/>
+          <w:color w:val="1E3A5F"/>
+          <w:sz w:val="26"/>
+          <w:szCs w:val="26"/>
+        </w:rPr>
+        <w:t xml:space="preserve">Team Contributors</w:t>
       </w:r>
     </w:p>
     <w:tbl>
@@ -62,13 +104,14 @@
         </w:tblBorders>
       </w:tblPr>
       <w:tblGrid>
-        <w:gridCol w:w="2400"/>
-        <w:gridCol w:w="4800"/>
+        <w:gridCol w:w="2800"/>
+        <w:gridCol w:w="1400"/>
+        <w:gridCol w:w="3000"/>
       </w:tblGrid>
       <w:tr>
         <w:tc>
           <w:tcPr>
-            <w:tcW w:type="dxa" w:w="2400"/>
+            <w:tcW w:type="dxa" w:w="2800"/>
             <w:tcBorders>
               <w:top w:val="single" w:color="CCCCCC" w:sz="1"/>
               <w:left w:val="single" w:color="CCCCCC" w:sz="1"/>
@@ -94,46 +137,13 @@
                 <w:sz w:val="18"/>
                 <w:szCs w:val="18"/>
               </w:rPr>
-              <w:t xml:space="preserve">Course</w:t>
-            </w:r>
-          </w:p>
-        </w:tc>
-        <w:tc>
-          <w:tcPr>
-            <w:tcW w:type="dxa" w:w="4800"/>
-            <w:tcBorders>
-              <w:top w:val="single" w:color="CCCCCC" w:sz="1"/>
-              <w:left w:val="single" w:color="CCCCCC" w:sz="1"/>
-              <w:bottom w:val="single" w:color="CCCCCC" w:sz="1"/>
-              <w:right w:val="single" w:color="CCCCCC" w:sz="1"/>
-            </w:tcBorders>
-            <w:tcMar>
-              <w:top w:type="dxa" w:w="80"/>
-              <w:left w:type="dxa" w:w="120"/>
-              <w:bottom w:type="dxa" w:w="80"/>
-              <w:right w:type="dxa" w:w="120"/>
-            </w:tcMar>
-            <w:vAlign w:val="center"/>
-          </w:tcPr>
-          <w:p>
-            <w:r>
-              <w:rPr>
-                <w:rFonts w:ascii="Arial" w:cs="Arial" w:eastAsia="Arial" w:hAnsi="Arial"/>
-                <w:b w:val="false"/>
-                <w:bCs w:val="false"/>
-                <w:color w:val="000000"/>
-                <w:sz w:val="18"/>
-                <w:szCs w:val="18"/>
-              </w:rPr>
-              <w:t xml:space="preserve">AI for Engineers</w:t>
-            </w:r>
-          </w:p>
-        </w:tc>
-      </w:tr>
-      <w:tr>
-        <w:tc>
-          <w:tcPr>
-            <w:tcW w:type="dxa" w:w="2400"/>
+              <w:t xml:space="preserve">Name</w:t>
+            </w:r>
+          </w:p>
+        </w:tc>
+        <w:tc>
+          <w:tcPr>
+            <w:tcW w:type="dxa" w:w="1400"/>
             <w:tcBorders>
               <w:top w:val="single" w:color="CCCCCC" w:sz="1"/>
               <w:left w:val="single" w:color="CCCCCC" w:sz="1"/>
@@ -159,46 +169,13 @@
                 <w:sz w:val="18"/>
                 <w:szCs w:val="18"/>
               </w:rPr>
-              <w:t xml:space="preserve">Assignment Type</w:t>
-            </w:r>
-          </w:p>
-        </w:tc>
-        <w:tc>
-          <w:tcPr>
-            <w:tcW w:type="dxa" w:w="4800"/>
-            <w:tcBorders>
-              <w:top w:val="single" w:color="CCCCCC" w:sz="1"/>
-              <w:left w:val="single" w:color="CCCCCC" w:sz="1"/>
-              <w:bottom w:val="single" w:color="CCCCCC" w:sz="1"/>
-              <w:right w:val="single" w:color="CCCCCC" w:sz="1"/>
-            </w:tcBorders>
-            <w:tcMar>
-              <w:top w:type="dxa" w:w="80"/>
-              <w:left w:type="dxa" w:w="120"/>
-              <w:bottom w:type="dxa" w:w="80"/>
-              <w:right w:type="dxa" w:w="120"/>
-            </w:tcMar>
-            <w:vAlign w:val="center"/>
-          </w:tcPr>
-          <w:p>
-            <w:r>
-              <w:rPr>
-                <w:rFonts w:ascii="Arial" w:cs="Arial" w:eastAsia="Arial" w:hAnsi="Arial"/>
-                <w:b w:val="false"/>
-                <w:bCs w:val="false"/>
-                <w:color w:val="000000"/>
-                <w:sz w:val="18"/>
-                <w:szCs w:val="18"/>
-              </w:rPr>
-              <w:t xml:space="preserve">Group of 5 Students</w:t>
-            </w:r>
-          </w:p>
-        </w:tc>
-      </w:tr>
-      <w:tr>
-        <w:tc>
-          <w:tcPr>
-            <w:tcW w:type="dxa" w:w="2400"/>
+              <w:t xml:space="preserve">Role</w:t>
+            </w:r>
+          </w:p>
+        </w:tc>
+        <w:tc>
+          <w:tcPr>
+            <w:tcW w:type="dxa" w:w="3000"/>
             <w:tcBorders>
               <w:top w:val="single" w:color="CCCCCC" w:sz="1"/>
               <w:left w:val="single" w:color="CCCCCC" w:sz="1"/>
@@ -224,38 +201,7 @@
                 <w:sz w:val="18"/>
                 <w:szCs w:val="18"/>
               </w:rPr>
-              <w:t xml:space="preserve">Total Marks</w:t>
-            </w:r>
-          </w:p>
-        </w:tc>
-        <w:tc>
-          <w:tcPr>
-            <w:tcW w:type="dxa" w:w="4800"/>
-            <w:tcBorders>
-              <w:top w:val="single" w:color="CCCCCC" w:sz="1"/>
-              <w:left w:val="single" w:color="CCCCCC" w:sz="1"/>
-              <w:bottom w:val="single" w:color="CCCCCC" w:sz="1"/>
-              <w:right w:val="single" w:color="CCCCCC" w:sz="1"/>
-            </w:tcBorders>
-            <w:tcMar>
-              <w:top w:type="dxa" w:w="80"/>
-              <w:left w:type="dxa" w:w="120"/>
-              <w:bottom w:type="dxa" w:w="80"/>
-              <w:right w:type="dxa" w:w="120"/>
-            </w:tcMar>
-            <w:vAlign w:val="center"/>
-          </w:tcPr>
-          <w:p>
-            <w:r>
-              <w:rPr>
-                <w:rFonts w:ascii="Arial" w:cs="Arial" w:eastAsia="Arial" w:hAnsi="Arial"/>
-                <w:b w:val="false"/>
-                <w:bCs w:val="false"/>
-                <w:color w:val="000000"/>
-                <w:sz w:val="18"/>
-                <w:szCs w:val="18"/>
-              </w:rPr>
-              <w:t xml:space="preserve">100 Marks</w:t>
+              <w:t xml:space="preserve">Contributions</w:t>
             </w:r>
           </w:p>
         </w:tc>
@@ -263,14 +209,12 @@
       <w:tr>
         <w:tc>
           <w:tcPr>
-            <w:tcW w:type="dxa" w:w="2400"/>
-            <w:tcBorders>
-              <w:top w:val="single" w:color="CCCCCC" w:sz="1"/>
-              <w:left w:val="single" w:color="CCCCCC" w:sz="1"/>
-              <w:bottom w:val="single" w:color="CCCCCC" w:sz="1"/>
-              <w:right w:val="single" w:color="CCCCCC" w:sz="1"/>
-            </w:tcBorders>
-            <w:shd w:fill="1E3A5F" w:val="clear"/>
+            <w:tcBorders>
+              <w:top w:val="single" w:color="CCCCCC" w:sz="1"/>
+              <w:left w:val="single" w:color="CCCCCC" w:sz="1"/>
+              <w:bottom w:val="single" w:color="CCCCCC" w:sz="1"/>
+              <w:right w:val="single" w:color="CCCCCC" w:sz="1"/>
+            </w:tcBorders>
             <w:tcMar>
               <w:top w:type="dxa" w:w="80"/>
               <w:left w:type="dxa" w:w="120"/>
@@ -285,42 +229,72 @@
                 <w:rFonts w:ascii="Arial" w:cs="Arial" w:eastAsia="Arial" w:hAnsi="Arial"/>
                 <w:b/>
                 <w:bCs/>
-                <w:color w:val="FFFFFF"/>
-                <w:sz w:val="18"/>
-                <w:szCs w:val="18"/>
-              </w:rPr>
-              <w:t xml:space="preserve">Duration</w:t>
-            </w:r>
-          </w:p>
-        </w:tc>
-        <w:tc>
-          <w:tcPr>
-            <w:tcW w:type="dxa" w:w="4800"/>
-            <w:tcBorders>
-              <w:top w:val="single" w:color="CCCCCC" w:sz="1"/>
-              <w:left w:val="single" w:color="CCCCCC" w:sz="1"/>
-              <w:bottom w:val="single" w:color="CCCCCC" w:sz="1"/>
-              <w:right w:val="single" w:color="CCCCCC" w:sz="1"/>
-            </w:tcBorders>
-            <w:tcMar>
-              <w:top w:type="dxa" w:w="80"/>
-              <w:left w:type="dxa" w:w="120"/>
-              <w:bottom w:type="dxa" w:w="80"/>
-              <w:right w:type="dxa" w:w="120"/>
-            </w:tcMar>
-            <w:vAlign w:val="center"/>
-          </w:tcPr>
-          <w:p>
-            <w:r>
-              <w:rPr>
-                <w:rFonts w:ascii="Arial" w:cs="Arial" w:eastAsia="Arial" w:hAnsi="Arial"/>
-                <w:b w:val="false"/>
-                <w:bCs w:val="false"/>
-                <w:color w:val="000000"/>
-                <w:sz w:val="18"/>
-                <w:szCs w:val="18"/>
-              </w:rPr>
-              <w:t xml:space="preserve">2 Weeks</w:t>
+                <w:color w:val="000000"/>
+                <w:sz w:val="18"/>
+                <w:szCs w:val="18"/>
+              </w:rPr>
+              <w:t xml:space="preserve">Adithya Reddy Geeda</w:t>
+            </w:r>
+          </w:p>
+        </w:tc>
+        <w:tc>
+          <w:tcPr>
+            <w:tcBorders>
+              <w:top w:val="single" w:color="CCCCCC" w:sz="1"/>
+              <w:left w:val="single" w:color="CCCCCC" w:sz="1"/>
+              <w:bottom w:val="single" w:color="CCCCCC" w:sz="1"/>
+              <w:right w:val="single" w:color="CCCCCC" w:sz="1"/>
+            </w:tcBorders>
+            <w:shd w:fill="E8F4E8" w:val="clear"/>
+            <w:tcMar>
+              <w:top w:type="dxa" w:w="80"/>
+              <w:left w:type="dxa" w:w="120"/>
+              <w:bottom w:type="dxa" w:w="80"/>
+              <w:right w:type="dxa" w:w="120"/>
+            </w:tcMar>
+            <w:vAlign w:val="center"/>
+          </w:tcPr>
+          <w:p>
+            <w:r>
+              <w:rPr>
+                <w:rFonts w:ascii="Arial" w:cs="Arial" w:eastAsia="Arial" w:hAnsi="Arial"/>
+                <w:b w:val="false"/>
+                <w:bCs w:val="false"/>
+                <w:color w:val="000000"/>
+                <w:sz w:val="18"/>
+                <w:szCs w:val="18"/>
+              </w:rPr>
+              <w:t xml:space="preserve">Lead</w:t>
+            </w:r>
+          </w:p>
+        </w:tc>
+        <w:tc>
+          <w:tcPr>
+            <w:tcBorders>
+              <w:top w:val="single" w:color="CCCCCC" w:sz="1"/>
+              <w:left w:val="single" w:color="CCCCCC" w:sz="1"/>
+              <w:bottom w:val="single" w:color="CCCCCC" w:sz="1"/>
+              <w:right w:val="single" w:color="CCCCCC" w:sz="1"/>
+            </w:tcBorders>
+            <w:tcMar>
+              <w:top w:type="dxa" w:w="80"/>
+              <w:left w:type="dxa" w:w="120"/>
+              <w:bottom w:type="dxa" w:w="80"/>
+              <w:right w:type="dxa" w:w="120"/>
+            </w:tcMar>
+            <w:vAlign w:val="center"/>
+          </w:tcPr>
+          <w:p>
+            <w:r>
+              <w:rPr>
+                <w:rFonts w:ascii="Arial" w:cs="Arial" w:eastAsia="Arial" w:hAnsi="Arial"/>
+                <w:b w:val="false"/>
+                <w:bCs w:val="false"/>
+                <w:color w:val="000000"/>
+                <w:sz w:val="18"/>
+                <w:szCs w:val="18"/>
+              </w:rPr>
+              <w:t xml:space="preserve">Audio module, Image module, Video module, Integration, React dashboard, Pipeline architecture, Project setup &amp; GitHub</w:t>
             </w:r>
           </w:p>
         </w:tc>
@@ -328,14 +302,12 @@
       <w:tr>
         <w:tc>
           <w:tcPr>
-            <w:tcW w:type="dxa" w:w="2400"/>
-            <w:tcBorders>
-              <w:top w:val="single" w:color="CCCCCC" w:sz="1"/>
-              <w:left w:val="single" w:color="CCCCCC" w:sz="1"/>
-              <w:bottom w:val="single" w:color="CCCCCC" w:sz="1"/>
-              <w:right w:val="single" w:color="CCCCCC" w:sz="1"/>
-            </w:tcBorders>
-            <w:shd w:fill="1E3A5F" w:val="clear"/>
+            <w:tcBorders>
+              <w:top w:val="single" w:color="CCCCCC" w:sz="1"/>
+              <w:left w:val="single" w:color="CCCCCC" w:sz="1"/>
+              <w:bottom w:val="single" w:color="CCCCCC" w:sz="1"/>
+              <w:right w:val="single" w:color="CCCCCC" w:sz="1"/>
+            </w:tcBorders>
             <w:tcMar>
               <w:top w:type="dxa" w:w="80"/>
               <w:left w:type="dxa" w:w="120"/>
@@ -350,42 +322,258 @@
                 <w:rFonts w:ascii="Arial" w:cs="Arial" w:eastAsia="Arial" w:hAnsi="Arial"/>
                 <w:b/>
                 <w:bCs/>
-                <w:color w:val="FFFFFF"/>
-                <w:sz w:val="18"/>
-                <w:szCs w:val="18"/>
-              </w:rPr>
-              <w:t xml:space="preserve">GitHub Repo</w:t>
-            </w:r>
-          </w:p>
-        </w:tc>
-        <w:tc>
-          <w:tcPr>
-            <w:tcW w:type="dxa" w:w="4800"/>
-            <w:tcBorders>
-              <w:top w:val="single" w:color="CCCCCC" w:sz="1"/>
-              <w:left w:val="single" w:color="CCCCCC" w:sz="1"/>
-              <w:bottom w:val="single" w:color="CCCCCC" w:sz="1"/>
-              <w:right w:val="single" w:color="CCCCCC" w:sz="1"/>
-            </w:tcBorders>
-            <w:tcMar>
-              <w:top w:type="dxa" w:w="80"/>
-              <w:left w:type="dxa" w:w="120"/>
-              <w:bottom w:type="dxa" w:w="80"/>
-              <w:right w:type="dxa" w:w="120"/>
-            </w:tcMar>
-            <w:vAlign w:val="center"/>
-          </w:tcPr>
-          <w:p>
-            <w:r>
-              <w:rPr>
-                <w:rFonts w:ascii="Arial" w:cs="Arial" w:eastAsia="Arial" w:hAnsi="Arial"/>
-                <w:b w:val="false"/>
-                <w:bCs w:val="false"/>
-                <w:color w:val="000000"/>
-                <w:sz w:val="18"/>
-                <w:szCs w:val="18"/>
-              </w:rPr>
-              <w:t xml:space="preserve">github.com/AdithyaReddyGeeda/Multimodal-Crime-Incident-Report-Analyzer</w:t>
+                <w:color w:val="000000"/>
+                <w:sz w:val="18"/>
+                <w:szCs w:val="18"/>
+              </w:rPr>
+              <w:t xml:space="preserve">Vidya Cheekuri</w:t>
+            </w:r>
+          </w:p>
+        </w:tc>
+        <w:tc>
+          <w:tcPr>
+            <w:tcBorders>
+              <w:top w:val="single" w:color="CCCCCC" w:sz="1"/>
+              <w:left w:val="single" w:color="CCCCCC" w:sz="1"/>
+              <w:bottom w:val="single" w:color="CCCCCC" w:sz="1"/>
+              <w:right w:val="single" w:color="CCCCCC" w:sz="1"/>
+            </w:tcBorders>
+            <w:shd w:fill="E8F4E8" w:val="clear"/>
+            <w:tcMar>
+              <w:top w:type="dxa" w:w="80"/>
+              <w:left w:type="dxa" w:w="120"/>
+              <w:bottom w:type="dxa" w:w="80"/>
+              <w:right w:type="dxa" w:w="120"/>
+            </w:tcMar>
+            <w:vAlign w:val="center"/>
+          </w:tcPr>
+          <w:p>
+            <w:r>
+              <w:rPr>
+                <w:rFonts w:ascii="Arial" w:cs="Arial" w:eastAsia="Arial" w:hAnsi="Arial"/>
+                <w:b w:val="false"/>
+                <w:bCs w:val="false"/>
+                <w:color w:val="000000"/>
+                <w:sz w:val="18"/>
+                <w:szCs w:val="18"/>
+              </w:rPr>
+              <w:t xml:space="preserve">Lead</w:t>
+            </w:r>
+          </w:p>
+        </w:tc>
+        <w:tc>
+          <w:tcPr>
+            <w:tcBorders>
+              <w:top w:val="single" w:color="CCCCCC" w:sz="1"/>
+              <w:left w:val="single" w:color="CCCCCC" w:sz="1"/>
+              <w:bottom w:val="single" w:color="CCCCCC" w:sz="1"/>
+              <w:right w:val="single" w:color="CCCCCC" w:sz="1"/>
+            </w:tcBorders>
+            <w:tcMar>
+              <w:top w:type="dxa" w:w="80"/>
+              <w:left w:type="dxa" w:w="120"/>
+              <w:bottom w:type="dxa" w:w="80"/>
+              <w:right w:type="dxa" w:w="120"/>
+            </w:tcMar>
+            <w:vAlign w:val="center"/>
+          </w:tcPr>
+          <w:p>
+            <w:r>
+              <w:rPr>
+                <w:rFonts w:ascii="Arial" w:cs="Arial" w:eastAsia="Arial" w:hAnsi="Arial"/>
+                <w:b w:val="false"/>
+                <w:bCs w:val="false"/>
+                <w:color w:val="000000"/>
+                <w:sz w:val="18"/>
+                <w:szCs w:val="18"/>
+              </w:rPr>
+              <w:t xml:space="preserve">Document module (PDF extraction, section splitting, OCR), Dashboard sync, Dashboard components (IncidentModal, StatsBar, App)</w:t>
+            </w:r>
+          </w:p>
+        </w:tc>
+      </w:tr>
+      <w:tr>
+        <w:tc>
+          <w:tcPr>
+            <w:tcBorders>
+              <w:top w:val="single" w:color="CCCCCC" w:sz="1"/>
+              <w:left w:val="single" w:color="CCCCCC" w:sz="1"/>
+              <w:bottom w:val="single" w:color="CCCCCC" w:sz="1"/>
+              <w:right w:val="single" w:color="CCCCCC" w:sz="1"/>
+            </w:tcBorders>
+            <w:tcMar>
+              <w:top w:type="dxa" w:w="80"/>
+              <w:left w:type="dxa" w:w="120"/>
+              <w:bottom w:type="dxa" w:w="80"/>
+              <w:right w:type="dxa" w:w="120"/>
+            </w:tcMar>
+            <w:vAlign w:val="center"/>
+          </w:tcPr>
+          <w:p>
+            <w:r>
+              <w:rPr>
+                <w:rFonts w:ascii="Arial" w:cs="Arial" w:eastAsia="Arial" w:hAnsi="Arial"/>
+                <w:b w:val="false"/>
+                <w:bCs w:val="false"/>
+                <w:color w:val="000000"/>
+                <w:sz w:val="18"/>
+                <w:szCs w:val="18"/>
+              </w:rPr>
+              <w:t xml:space="preserve">Meghansh</w:t>
+            </w:r>
+          </w:p>
+        </w:tc>
+        <w:tc>
+          <w:tcPr>
+            <w:tcBorders>
+              <w:top w:val="single" w:color="CCCCCC" w:sz="1"/>
+              <w:left w:val="single" w:color="CCCCCC" w:sz="1"/>
+              <w:bottom w:val="single" w:color="CCCCCC" w:sz="1"/>
+              <w:right w:val="single" w:color="CCCCCC" w:sz="1"/>
+            </w:tcBorders>
+            <w:shd w:fill="FFF8E8" w:val="clear"/>
+            <w:tcMar>
+              <w:top w:type="dxa" w:w="80"/>
+              <w:left w:type="dxa" w:w="120"/>
+              <w:bottom w:type="dxa" w:w="80"/>
+              <w:right w:type="dxa" w:w="120"/>
+            </w:tcMar>
+            <w:vAlign w:val="center"/>
+          </w:tcPr>
+          <w:p>
+            <w:r>
+              <w:rPr>
+                <w:rFonts w:ascii="Arial" w:cs="Arial" w:eastAsia="Arial" w:hAnsi="Arial"/>
+                <w:b w:val="false"/>
+                <w:bCs w:val="false"/>
+                <w:color w:val="000000"/>
+                <w:sz w:val="18"/>
+                <w:szCs w:val="18"/>
+              </w:rPr>
+              <w:t xml:space="preserve">Contributor</w:t>
+            </w:r>
+          </w:p>
+        </w:tc>
+        <w:tc>
+          <w:tcPr>
+            <w:tcBorders>
+              <w:top w:val="single" w:color="CCCCCC" w:sz="1"/>
+              <w:left w:val="single" w:color="CCCCCC" w:sz="1"/>
+              <w:bottom w:val="single" w:color="CCCCCC" w:sz="1"/>
+              <w:right w:val="single" w:color="CCCCCC" w:sz="1"/>
+            </w:tcBorders>
+            <w:tcMar>
+              <w:top w:type="dxa" w:w="80"/>
+              <w:left w:type="dxa" w:w="120"/>
+              <w:bottom w:type="dxa" w:w="80"/>
+              <w:right w:type="dxa" w:w="120"/>
+            </w:tcMar>
+            <w:vAlign w:val="center"/>
+          </w:tcPr>
+          <w:p>
+            <w:r>
+              <w:rPr>
+                <w:rFonts w:ascii="Arial" w:cs="Arial" w:eastAsia="Arial" w:hAnsi="Arial"/>
+                <w:b w:val="false"/>
+                <w:bCs w:val="false"/>
+                <w:color w:val="000000"/>
+                <w:sz w:val="18"/>
+                <w:szCs w:val="18"/>
+              </w:rPr>
+              <w:t xml:space="preserve">Text analyst module (NLP pipeline, sentiment analysis, topic classification)</w:t>
+            </w:r>
+          </w:p>
+        </w:tc>
+      </w:tr>
+      <w:tr>
+        <w:tc>
+          <w:tcPr>
+            <w:tcBorders>
+              <w:top w:val="single" w:color="CCCCCC" w:sz="1"/>
+              <w:left w:val="single" w:color="CCCCCC" w:sz="1"/>
+              <w:bottom w:val="single" w:color="CCCCCC" w:sz="1"/>
+              <w:right w:val="single" w:color="CCCCCC" w:sz="1"/>
+            </w:tcBorders>
+            <w:tcMar>
+              <w:top w:type="dxa" w:w="80"/>
+              <w:left w:type="dxa" w:w="120"/>
+              <w:bottom w:type="dxa" w:w="80"/>
+              <w:right w:type="dxa" w:w="120"/>
+            </w:tcMar>
+            <w:vAlign w:val="center"/>
+          </w:tcPr>
+          <w:p>
+            <w:r>
+              <w:rPr>
+                <w:rFonts w:ascii="Arial" w:cs="Arial" w:eastAsia="Arial" w:hAnsi="Arial"/>
+                <w:b w:val="false"/>
+                <w:bCs w:val="false"/>
+                <w:color w:val="000000"/>
+                <w:sz w:val="18"/>
+                <w:szCs w:val="18"/>
+              </w:rPr>
+              <w:t xml:space="preserve">Tamjida</w:t>
+            </w:r>
+          </w:p>
+        </w:tc>
+        <w:tc>
+          <w:tcPr>
+            <w:tcBorders>
+              <w:top w:val="single" w:color="CCCCCC" w:sz="1"/>
+              <w:left w:val="single" w:color="CCCCCC" w:sz="1"/>
+              <w:bottom w:val="single" w:color="CCCCCC" w:sz="1"/>
+              <w:right w:val="single" w:color="CCCCCC" w:sz="1"/>
+            </w:tcBorders>
+            <w:shd w:fill="FFF8E8" w:val="clear"/>
+            <w:tcMar>
+              <w:top w:type="dxa" w:w="80"/>
+              <w:left w:type="dxa" w:w="120"/>
+              <w:bottom w:type="dxa" w:w="80"/>
+              <w:right w:type="dxa" w:w="120"/>
+            </w:tcMar>
+            <w:vAlign w:val="center"/>
+          </w:tcPr>
+          <w:p>
+            <w:r>
+              <w:rPr>
+                <w:rFonts w:ascii="Arial" w:cs="Arial" w:eastAsia="Arial" w:hAnsi="Arial"/>
+                <w:b w:val="false"/>
+                <w:bCs w:val="false"/>
+                <w:color w:val="000000"/>
+                <w:sz w:val="18"/>
+                <w:szCs w:val="18"/>
+              </w:rPr>
+              <w:t xml:space="preserve">Contributor</w:t>
+            </w:r>
+          </w:p>
+        </w:tc>
+        <w:tc>
+          <w:tcPr>
+            <w:tcBorders>
+              <w:top w:val="single" w:color="CCCCCC" w:sz="1"/>
+              <w:left w:val="single" w:color="CCCCCC" w:sz="1"/>
+              <w:bottom w:val="single" w:color="CCCCCC" w:sz="1"/>
+              <w:right w:val="single" w:color="CCCCCC" w:sz="1"/>
+            </w:tcBorders>
+            <w:tcMar>
+              <w:top w:type="dxa" w:w="80"/>
+              <w:left w:type="dxa" w:w="120"/>
+              <w:bottom w:type="dxa" w:w="80"/>
+              <w:right w:type="dxa" w:w="120"/>
+            </w:tcMar>
+            <w:vAlign w:val="center"/>
+          </w:tcPr>
+          <w:p>
+            <w:r>
+              <w:rPr>
+                <w:rFonts w:ascii="Arial" w:cs="Arial" w:eastAsia="Arial" w:hAnsi="Arial"/>
+                <w:b w:val="false"/>
+                <w:bCs w:val="false"/>
+                <w:color w:val="000000"/>
+                <w:sz w:val="18"/>
+                <w:szCs w:val="18"/>
+              </w:rPr>
+              <w:t xml:space="preserve">Project documentation and README</w:t>
             </w:r>
           </w:p>
         </w:tc>
@@ -4718,1077 +4906,6 @@
       <w:pPr>
         <w:spacing w:after="120"/>
       </w:pPr>
-    </w:p>
-    <w:p>
-      <w:pPr>
-        <w:pStyle w:val="Heading1"/>
-        <w:spacing w:after="160" w:before="320"/>
-      </w:pPr>
-      <w:r>
-        <w:rPr>
-          <w:rFonts w:ascii="Arial" w:cs="Arial" w:eastAsia="Arial" w:hAnsi="Arial"/>
-          <w:b/>
-          <w:bCs/>
-          <w:color w:val="1E3A5F"/>
-          <w:sz w:val="28"/>
-          <w:szCs w:val="28"/>
-        </w:rPr>
-        <w:t xml:space="preserve">7. Challenges and Solutions</w:t>
-      </w:r>
-    </w:p>
-    <w:p>
-      <w:pPr>
-        <w:pStyle w:val="ListParagraph"/>
-        <w:numPr>
-          <w:ilvl w:val="0"/>
-          <w:numId w:val="2"/>
-        </w:numPr>
-        <w:spacing w:after="60"/>
-      </w:pPr>
-      <w:r>
-        <w:rPr>
-          <w:rFonts w:ascii="Arial" w:cs="Arial" w:eastAsia="Arial" w:hAnsi="Arial"/>
-          <w:color w:val="1a1a1a"/>
-          <w:sz w:val="22"/>
-          <w:szCs w:val="22"/>
-        </w:rPr>
-        <w:t xml:space="preserve">Audio — Whisper local transcription required ffmpeg to be installed separately (brew install ffmpeg). Synthetic audio (gTTS) was used because real 911 audio datasets require institutional approval.</w:t>
-      </w:r>
-    </w:p>
-    <w:p>
-      <w:pPr>
-        <w:pStyle w:val="ListParagraph"/>
-        <w:numPr>
-          <w:ilvl w:val="0"/>
-          <w:numId w:val="2"/>
-        </w:numPr>
-        <w:spacing w:after="60"/>
-      </w:pPr>
-      <w:r>
-        <w:rPr>
-          <w:rFonts w:ascii="Arial" w:cs="Arial" w:eastAsia="Arial" w:hAnsi="Arial"/>
-          <w:color w:val="1a1a1a"/>
-          <w:sz w:val="22"/>
-          <w:szCs w:val="22"/>
-        </w:rPr>
-        <w:t xml:space="preserve">Documents — The FOIA PDF mixes scanned and text-based pages. The module falls back to pytesseract OCR for low-text pages. The multi-department document required a custom section splitter to generate meaningful per-department rows.</w:t>
-      </w:r>
-    </w:p>
-    <w:p>
-      <w:pPr>
-        <w:pStyle w:val="ListParagraph"/>
-        <w:numPr>
-          <w:ilvl w:val="0"/>
-          <w:numId w:val="2"/>
-        </w:numPr>
-        <w:spacing w:after="60"/>
-      </w:pPr>
-      <w:r>
-        <w:rPr>
-          <w:rFonts w:ascii="Arial" w:cs="Arial" w:eastAsia="Arial" w:hAnsi="Arial"/>
-          <w:color w:val="1a1a1a"/>
-          <w:sz w:val="22"/>
-          <w:szCs w:val="22"/>
-        </w:rPr>
-        <w:t xml:space="preserve">Images — Roboflow API rate limits required batching requests. YOLOv8n was added as a fallback model for when the API is unavailable.</w:t>
-      </w:r>
-    </w:p>
-    <w:p>
-      <w:pPr>
-        <w:pStyle w:val="ListParagraph"/>
-        <w:numPr>
-          <w:ilvl w:val="0"/>
-          <w:numId w:val="2"/>
-        </w:numPr>
-        <w:spacing w:after="60"/>
-      </w:pPr>
-      <w:r>
-        <w:rPr>
-          <w:rFonts w:ascii="Arial" w:cs="Arial" w:eastAsia="Arial" w:hAnsi="Arial"/>
-          <w:color w:val="1a1a1a"/>
-          <w:sz w:val="22"/>
-          <w:szCs w:val="22"/>
-        </w:rPr>
-        <w:t xml:space="preserve">Video — CAVIAR .mpg files required OpenCV codec support (libavcodec). Processing all 12 videos at full resolution was computationally intensive; frame sampling was used to reduce load.</w:t>
-      </w:r>
-    </w:p>
-    <w:p>
-      <w:pPr>
-        <w:pStyle w:val="ListParagraph"/>
-        <w:numPr>
-          <w:ilvl w:val="0"/>
-          <w:numId w:val="2"/>
-        </w:numPr>
-        <w:spacing w:after="60"/>
-      </w:pPr>
-      <w:r>
-        <w:rPr>
-          <w:rFonts w:ascii="Arial" w:cs="Arial" w:eastAsia="Arial" w:hAnsi="Arial"/>
-          <w:color w:val="1a1a1a"/>
-          <w:sz w:val="22"/>
-          <w:szCs w:val="22"/>
-        </w:rPr>
-        <w:t xml:space="preserve">Text — The BART zero-shot model is large (∼1.6 GB). A fallback keyword classifier is used when GPU memory is unavailable.</w:t>
-      </w:r>
-    </w:p>
-    <w:p>
-      <w:pPr>
-        <w:pStyle w:val="ListParagraph"/>
-        <w:numPr>
-          <w:ilvl w:val="0"/>
-          <w:numId w:val="2"/>
-        </w:numPr>
-        <w:spacing w:after="60"/>
-      </w:pPr>
-      <w:r>
-        <w:rPr>
-          <w:rFonts w:ascii="Arial" w:cs="Arial" w:eastAsia="Arial" w:hAnsi="Arial"/>
-          <w:color w:val="1a1a1a"/>
-          <w:sz w:val="22"/>
-          <w:szCs w:val="22"/>
-        </w:rPr>
-        <w:t xml:space="preserve">Integration — Confidence scores use different scales across modules (0–1 float for images/video, 0–10 integer for audio urgency). The integrator normalises these to a common 0–1 scale before severity scoring.</w:t>
-      </w:r>
-    </w:p>
-    <w:p>
-      <w:pPr>
-        <w:spacing w:after="120"/>
-      </w:pPr>
-    </w:p>
-    <w:p>
-      <w:pPr>
-        <w:pStyle w:val="Heading1"/>
-        <w:spacing w:after="160" w:before="320"/>
-      </w:pPr>
-      <w:r>
-        <w:rPr>
-          <w:rFonts w:ascii="Arial" w:cs="Arial" w:eastAsia="Arial" w:hAnsi="Arial"/>
-          <w:b/>
-          <w:bCs/>
-          <w:color w:val="1E3A5F"/>
-          <w:sz w:val="28"/>
-          <w:szCs w:val="28"/>
-        </w:rPr>
-        <w:t xml:space="preserve">8. Marking Rubric Alignment</w:t>
-      </w:r>
-    </w:p>
-    <w:p>
-      <w:pPr>
-        <w:spacing w:after="120"/>
-      </w:pPr>
-    </w:p>
-    <w:tbl>
-      <w:tblPr>
-        <w:tblW w:type="dxa" w:w="9360"/>
-        <w:tblBorders>
-          <w:top w:val="single" w:color="auto" w:sz="4"/>
-          <w:left w:val="single" w:color="auto" w:sz="4"/>
-          <w:bottom w:val="single" w:color="auto" w:sz="4"/>
-          <w:right w:val="single" w:color="auto" w:sz="4"/>
-          <w:insideH w:val="single" w:color="auto" w:sz="4"/>
-          <w:insideV w:val="single" w:color="auto" w:sz="4"/>
-        </w:tblBorders>
-      </w:tblPr>
-      <w:tblGrid>
-        <w:gridCol w:w="2800"/>
-        <w:gridCol w:w="960"/>
-        <w:gridCol w:w="5600"/>
-      </w:tblGrid>
-      <w:tr>
-        <w:tc>
-          <w:tcPr>
-            <w:tcW w:type="dxa" w:w="2800"/>
-            <w:tcBorders>
-              <w:top w:val="single" w:color="CCCCCC" w:sz="1"/>
-              <w:left w:val="single" w:color="CCCCCC" w:sz="1"/>
-              <w:bottom w:val="single" w:color="CCCCCC" w:sz="1"/>
-              <w:right w:val="single" w:color="CCCCCC" w:sz="1"/>
-            </w:tcBorders>
-            <w:shd w:fill="1E3A5F" w:val="clear"/>
-            <w:tcMar>
-              <w:top w:type="dxa" w:w="80"/>
-              <w:left w:type="dxa" w:w="120"/>
-              <w:bottom w:type="dxa" w:w="80"/>
-              <w:right w:type="dxa" w:w="120"/>
-            </w:tcMar>
-            <w:vAlign w:val="center"/>
-          </w:tcPr>
-          <w:p>
-            <w:r>
-              <w:rPr>
-                <w:rFonts w:ascii="Arial" w:cs="Arial" w:eastAsia="Arial" w:hAnsi="Arial"/>
-                <w:b/>
-                <w:bCs/>
-                <w:color w:val="FFFFFF"/>
-                <w:sz w:val="18"/>
-                <w:szCs w:val="18"/>
-              </w:rPr>
-              <w:t xml:space="preserve">Criteria</w:t>
-            </w:r>
-          </w:p>
-        </w:tc>
-        <w:tc>
-          <w:tcPr>
-            <w:tcW w:type="dxa" w:w="960"/>
-            <w:tcBorders>
-              <w:top w:val="single" w:color="CCCCCC" w:sz="1"/>
-              <w:left w:val="single" w:color="CCCCCC" w:sz="1"/>
-              <w:bottom w:val="single" w:color="CCCCCC" w:sz="1"/>
-              <w:right w:val="single" w:color="CCCCCC" w:sz="1"/>
-            </w:tcBorders>
-            <w:shd w:fill="1E3A5F" w:val="clear"/>
-            <w:tcMar>
-              <w:top w:type="dxa" w:w="80"/>
-              <w:left w:type="dxa" w:w="120"/>
-              <w:bottom w:type="dxa" w:w="80"/>
-              <w:right w:type="dxa" w:w="120"/>
-            </w:tcMar>
-            <w:vAlign w:val="center"/>
-          </w:tcPr>
-          <w:p>
-            <w:r>
-              <w:rPr>
-                <w:rFonts w:ascii="Arial" w:cs="Arial" w:eastAsia="Arial" w:hAnsi="Arial"/>
-                <w:b/>
-                <w:bCs/>
-                <w:color w:val="FFFFFF"/>
-                <w:sz w:val="18"/>
-                <w:szCs w:val="18"/>
-              </w:rPr>
-              <w:t xml:space="preserve">Weight</w:t>
-            </w:r>
-          </w:p>
-        </w:tc>
-        <w:tc>
-          <w:tcPr>
-            <w:tcW w:type="dxa" w:w="5600"/>
-            <w:tcBorders>
-              <w:top w:val="single" w:color="CCCCCC" w:sz="1"/>
-              <w:left w:val="single" w:color="CCCCCC" w:sz="1"/>
-              <w:bottom w:val="single" w:color="CCCCCC" w:sz="1"/>
-              <w:right w:val="single" w:color="CCCCCC" w:sz="1"/>
-            </w:tcBorders>
-            <w:shd w:fill="1E3A5F" w:val="clear"/>
-            <w:tcMar>
-              <w:top w:type="dxa" w:w="80"/>
-              <w:left w:type="dxa" w:w="120"/>
-              <w:bottom w:type="dxa" w:w="80"/>
-              <w:right w:type="dxa" w:w="120"/>
-            </w:tcMar>
-            <w:vAlign w:val="center"/>
-          </w:tcPr>
-          <w:p>
-            <w:r>
-              <w:rPr>
-                <w:rFonts w:ascii="Arial" w:cs="Arial" w:eastAsia="Arial" w:hAnsi="Arial"/>
-                <w:b/>
-                <w:bCs/>
-                <w:color w:val="FFFFFF"/>
-                <w:sz w:val="18"/>
-                <w:szCs w:val="18"/>
-              </w:rPr>
-              <w:t xml:space="preserve">How We Address It</w:t>
-            </w:r>
-          </w:p>
-        </w:tc>
-      </w:tr>
-      <w:tr>
-        <w:tc>
-          <w:tcPr>
-            <w:tcBorders>
-              <w:top w:val="single" w:color="CCCCCC" w:sz="1"/>
-              <w:left w:val="single" w:color="CCCCCC" w:sz="1"/>
-              <w:bottom w:val="single" w:color="CCCCCC" w:sz="1"/>
-              <w:right w:val="single" w:color="CCCCCC" w:sz="1"/>
-            </w:tcBorders>
-            <w:tcMar>
-              <w:top w:type="dxa" w:w="80"/>
-              <w:left w:type="dxa" w:w="120"/>
-              <w:bottom w:type="dxa" w:w="80"/>
-              <w:right w:type="dxa" w:w="120"/>
-            </w:tcMar>
-            <w:vAlign w:val="center"/>
-          </w:tcPr>
-          <w:p>
-            <w:r>
-              <w:rPr>
-                <w:rFonts w:ascii="Arial" w:cs="Arial" w:eastAsia="Arial" w:hAnsi="Arial"/>
-                <w:b w:val="false"/>
-                <w:bCs w:val="false"/>
-                <w:color w:val="000000"/>
-                <w:sz w:val="18"/>
-                <w:szCs w:val="18"/>
-              </w:rPr>
-              <w:t xml:space="preserve">Problem Understanding</w:t>
-            </w:r>
-          </w:p>
-        </w:tc>
-        <w:tc>
-          <w:tcPr>
-            <w:tcBorders>
-              <w:top w:val="single" w:color="CCCCCC" w:sz="1"/>
-              <w:left w:val="single" w:color="CCCCCC" w:sz="1"/>
-              <w:bottom w:val="single" w:color="CCCCCC" w:sz="1"/>
-              <w:right w:val="single" w:color="CCCCCC" w:sz="1"/>
-            </w:tcBorders>
-            <w:tcMar>
-              <w:top w:type="dxa" w:w="80"/>
-              <w:left w:type="dxa" w:w="120"/>
-              <w:bottom w:type="dxa" w:w="80"/>
-              <w:right w:type="dxa" w:w="120"/>
-            </w:tcMar>
-            <w:vAlign w:val="center"/>
-          </w:tcPr>
-          <w:p>
-            <w:r>
-              <w:rPr>
-                <w:rFonts w:ascii="Arial" w:cs="Arial" w:eastAsia="Arial" w:hAnsi="Arial"/>
-                <w:b w:val="false"/>
-                <w:bCs w:val="false"/>
-                <w:color w:val="000000"/>
-                <w:sz w:val="18"/>
-                <w:szCs w:val="18"/>
-              </w:rPr>
-              <w:t xml:space="preserve">10%</w:t>
-            </w:r>
-          </w:p>
-        </w:tc>
-        <w:tc>
-          <w:tcPr>
-            <w:tcBorders>
-              <w:top w:val="single" w:color="CCCCCC" w:sz="1"/>
-              <w:left w:val="single" w:color="CCCCCC" w:sz="1"/>
-              <w:bottom w:val="single" w:color="CCCCCC" w:sz="1"/>
-              <w:right w:val="single" w:color="CCCCCC" w:sz="1"/>
-            </w:tcBorders>
-            <w:tcMar>
-              <w:top w:type="dxa" w:w="80"/>
-              <w:left w:type="dxa" w:w="120"/>
-              <w:bottom w:type="dxa" w:w="80"/>
-              <w:right w:type="dxa" w:w="120"/>
-            </w:tcMar>
-            <w:vAlign w:val="center"/>
-          </w:tcPr>
-          <w:p>
-            <w:r>
-              <w:rPr>
-                <w:rFonts w:ascii="Arial" w:cs="Arial" w:eastAsia="Arial" w:hAnsi="Arial"/>
-                <w:b w:val="false"/>
-                <w:bCs w:val="false"/>
-                <w:color w:val="000000"/>
-                <w:sz w:val="18"/>
-                <w:szCs w:val="18"/>
-              </w:rPr>
-              <w:t xml:space="preserve">Full background section above; each student owns one modality end-to-end.</w:t>
-            </w:r>
-          </w:p>
-        </w:tc>
-      </w:tr>
-      <w:tr>
-        <w:tc>
-          <w:tcPr>
-            <w:tcBorders>
-              <w:top w:val="single" w:color="CCCCCC" w:sz="1"/>
-              <w:left w:val="single" w:color="CCCCCC" w:sz="1"/>
-              <w:bottom w:val="single" w:color="CCCCCC" w:sz="1"/>
-              <w:right w:val="single" w:color="CCCCCC" w:sz="1"/>
-            </w:tcBorders>
-            <w:tcMar>
-              <w:top w:type="dxa" w:w="80"/>
-              <w:left w:type="dxa" w:w="120"/>
-              <w:bottom w:type="dxa" w:w="80"/>
-              <w:right w:type="dxa" w:w="120"/>
-            </w:tcMar>
-            <w:vAlign w:val="center"/>
-          </w:tcPr>
-          <w:p>
-            <w:r>
-              <w:rPr>
-                <w:rFonts w:ascii="Arial" w:cs="Arial" w:eastAsia="Arial" w:hAnsi="Arial"/>
-                <w:b w:val="false"/>
-                <w:bCs w:val="false"/>
-                <w:color w:val="000000"/>
-                <w:sz w:val="18"/>
-                <w:szCs w:val="18"/>
-              </w:rPr>
-              <w:t xml:space="preserve">Data Collection</w:t>
-            </w:r>
-          </w:p>
-        </w:tc>
-        <w:tc>
-          <w:tcPr>
-            <w:tcBorders>
-              <w:top w:val="single" w:color="CCCCCC" w:sz="1"/>
-              <w:left w:val="single" w:color="CCCCCC" w:sz="1"/>
-              <w:bottom w:val="single" w:color="CCCCCC" w:sz="1"/>
-              <w:right w:val="single" w:color="CCCCCC" w:sz="1"/>
-            </w:tcBorders>
-            <w:tcMar>
-              <w:top w:type="dxa" w:w="80"/>
-              <w:left w:type="dxa" w:w="120"/>
-              <w:bottom w:type="dxa" w:w="80"/>
-              <w:right w:type="dxa" w:w="120"/>
-            </w:tcMar>
-            <w:vAlign w:val="center"/>
-          </w:tcPr>
-          <w:p>
-            <w:r>
-              <w:rPr>
-                <w:rFonts w:ascii="Arial" w:cs="Arial" w:eastAsia="Arial" w:hAnsi="Arial"/>
-                <w:b w:val="false"/>
-                <w:bCs w:val="false"/>
-                <w:color w:val="000000"/>
-                <w:sz w:val="18"/>
-                <w:szCs w:val="18"/>
-              </w:rPr>
-              <w:t xml:space="preserve">15%</w:t>
-            </w:r>
-          </w:p>
-        </w:tc>
-        <w:tc>
-          <w:tcPr>
-            <w:tcBorders>
-              <w:top w:val="single" w:color="CCCCCC" w:sz="1"/>
-              <w:left w:val="single" w:color="CCCCCC" w:sz="1"/>
-              <w:bottom w:val="single" w:color="CCCCCC" w:sz="1"/>
-              <w:right w:val="single" w:color="CCCCCC" w:sz="1"/>
-            </w:tcBorders>
-            <w:tcMar>
-              <w:top w:type="dxa" w:w="80"/>
-              <w:left w:type="dxa" w:w="120"/>
-              <w:bottom w:type="dxa" w:w="80"/>
-              <w:right w:type="dxa" w:w="120"/>
-            </w:tcMar>
-            <w:vAlign w:val="center"/>
-          </w:tcPr>
-          <w:p>
-            <w:r>
-              <w:rPr>
-                <w:rFonts w:ascii="Arial" w:cs="Arial" w:eastAsia="Arial" w:hAnsi="Arial"/>
-                <w:b w:val="false"/>
-                <w:bCs w:val="false"/>
-                <w:color w:val="000000"/>
-                <w:sz w:val="18"/>
-                <w:szCs w:val="18"/>
-              </w:rPr>
-              <w:t xml:space="preserve">Five real/synthetic datasets: gTTS audio, MuckRock FOIA PDF, Roboflow images, CAVIAR video, Kaggle CrimeReport text.</w:t>
-            </w:r>
-          </w:p>
-        </w:tc>
-      </w:tr>
-      <w:tr>
-        <w:tc>
-          <w:tcPr>
-            <w:tcBorders>
-              <w:top w:val="single" w:color="CCCCCC" w:sz="1"/>
-              <w:left w:val="single" w:color="CCCCCC" w:sz="1"/>
-              <w:bottom w:val="single" w:color="CCCCCC" w:sz="1"/>
-              <w:right w:val="single" w:color="CCCCCC" w:sz="1"/>
-            </w:tcBorders>
-            <w:tcMar>
-              <w:top w:type="dxa" w:w="80"/>
-              <w:left w:type="dxa" w:w="120"/>
-              <w:bottom w:type="dxa" w:w="80"/>
-              <w:right w:type="dxa" w:w="120"/>
-            </w:tcMar>
-            <w:vAlign w:val="center"/>
-          </w:tcPr>
-          <w:p>
-            <w:r>
-              <w:rPr>
-                <w:rFonts w:ascii="Arial" w:cs="Arial" w:eastAsia="Arial" w:hAnsi="Arial"/>
-                <w:b w:val="false"/>
-                <w:bCs w:val="false"/>
-                <w:color w:val="000000"/>
-                <w:sz w:val="18"/>
-                <w:szCs w:val="18"/>
-              </w:rPr>
-              <w:t xml:space="preserve">AI Model Implementation</w:t>
-            </w:r>
-          </w:p>
-        </w:tc>
-        <w:tc>
-          <w:tcPr>
-            <w:tcBorders>
-              <w:top w:val="single" w:color="CCCCCC" w:sz="1"/>
-              <w:left w:val="single" w:color="CCCCCC" w:sz="1"/>
-              <w:bottom w:val="single" w:color="CCCCCC" w:sz="1"/>
-              <w:right w:val="single" w:color="CCCCCC" w:sz="1"/>
-            </w:tcBorders>
-            <w:tcMar>
-              <w:top w:type="dxa" w:w="80"/>
-              <w:left w:type="dxa" w:w="120"/>
-              <w:bottom w:type="dxa" w:w="80"/>
-              <w:right w:type="dxa" w:w="120"/>
-            </w:tcMar>
-            <w:vAlign w:val="center"/>
-          </w:tcPr>
-          <w:p>
-            <w:r>
-              <w:rPr>
-                <w:rFonts w:ascii="Arial" w:cs="Arial" w:eastAsia="Arial" w:hAnsi="Arial"/>
-                <w:b w:val="false"/>
-                <w:bCs w:val="false"/>
-                <w:color w:val="000000"/>
-                <w:sz w:val="18"/>
-                <w:szCs w:val="18"/>
-              </w:rPr>
-              <w:t xml:space="preserve">25%</w:t>
-            </w:r>
-          </w:p>
-        </w:tc>
-        <w:tc>
-          <w:tcPr>
-            <w:tcBorders>
-              <w:top w:val="single" w:color="CCCCCC" w:sz="1"/>
-              <w:left w:val="single" w:color="CCCCCC" w:sz="1"/>
-              <w:bottom w:val="single" w:color="CCCCCC" w:sz="1"/>
-              <w:right w:val="single" w:color="CCCCCC" w:sz="1"/>
-            </w:tcBorders>
-            <w:tcMar>
-              <w:top w:type="dxa" w:w="80"/>
-              <w:left w:type="dxa" w:w="120"/>
-              <w:bottom w:type="dxa" w:w="80"/>
-              <w:right w:type="dxa" w:w="120"/>
-            </w:tcMar>
-            <w:vAlign w:val="center"/>
-          </w:tcPr>
-          <w:p>
-            <w:r>
-              <w:rPr>
-                <w:rFonts w:ascii="Arial" w:cs="Arial" w:eastAsia="Arial" w:hAnsi="Arial"/>
-                <w:b w:val="false"/>
-                <w:bCs w:val="false"/>
-                <w:color w:val="000000"/>
-                <w:sz w:val="18"/>
-                <w:szCs w:val="18"/>
-              </w:rPr>
-              <w:t xml:space="preserve">Whisper ASR, spaCy NER, HuggingFace transformers, Roboflow + YOLOv8, OpenCV motion detection, BART zero-shot — all working and producing output.</w:t>
-            </w:r>
-          </w:p>
-        </w:tc>
-      </w:tr>
-      <w:tr>
-        <w:tc>
-          <w:tcPr>
-            <w:tcBorders>
-              <w:top w:val="single" w:color="CCCCCC" w:sz="1"/>
-              <w:left w:val="single" w:color="CCCCCC" w:sz="1"/>
-              <w:bottom w:val="single" w:color="CCCCCC" w:sz="1"/>
-              <w:right w:val="single" w:color="CCCCCC" w:sz="1"/>
-            </w:tcBorders>
-            <w:tcMar>
-              <w:top w:type="dxa" w:w="80"/>
-              <w:left w:type="dxa" w:w="120"/>
-              <w:bottom w:type="dxa" w:w="80"/>
-              <w:right w:type="dxa" w:w="120"/>
-            </w:tcMar>
-            <w:vAlign w:val="center"/>
-          </w:tcPr>
-          <w:p>
-            <w:r>
-              <w:rPr>
-                <w:rFonts w:ascii="Arial" w:cs="Arial" w:eastAsia="Arial" w:hAnsi="Arial"/>
-                <w:b w:val="false"/>
-                <w:bCs w:val="false"/>
-                <w:color w:val="000000"/>
-                <w:sz w:val="18"/>
-                <w:szCs w:val="18"/>
-              </w:rPr>
-              <w:t xml:space="preserve">Pipeline Design</w:t>
-            </w:r>
-          </w:p>
-        </w:tc>
-        <w:tc>
-          <w:tcPr>
-            <w:tcBorders>
-              <w:top w:val="single" w:color="CCCCCC" w:sz="1"/>
-              <w:left w:val="single" w:color="CCCCCC" w:sz="1"/>
-              <w:bottom w:val="single" w:color="CCCCCC" w:sz="1"/>
-              <w:right w:val="single" w:color="CCCCCC" w:sz="1"/>
-            </w:tcBorders>
-            <w:tcMar>
-              <w:top w:type="dxa" w:w="80"/>
-              <w:left w:type="dxa" w:w="120"/>
-              <w:bottom w:type="dxa" w:w="80"/>
-              <w:right w:type="dxa" w:w="120"/>
-            </w:tcMar>
-            <w:vAlign w:val="center"/>
-          </w:tcPr>
-          <w:p>
-            <w:r>
-              <w:rPr>
-                <w:rFonts w:ascii="Arial" w:cs="Arial" w:eastAsia="Arial" w:hAnsi="Arial"/>
-                <w:b w:val="false"/>
-                <w:bCs w:val="false"/>
-                <w:color w:val="000000"/>
-                <w:sz w:val="18"/>
-                <w:szCs w:val="18"/>
-              </w:rPr>
-              <w:t xml:space="preserve">15%</w:t>
-            </w:r>
-          </w:p>
-        </w:tc>
-        <w:tc>
-          <w:tcPr>
-            <w:tcBorders>
-              <w:top w:val="single" w:color="CCCCCC" w:sz="1"/>
-              <w:left w:val="single" w:color="CCCCCC" w:sz="1"/>
-              <w:bottom w:val="single" w:color="CCCCCC" w:sz="1"/>
-              <w:right w:val="single" w:color="CCCCCC" w:sz="1"/>
-            </w:tcBorders>
-            <w:tcMar>
-              <w:top w:type="dxa" w:w="80"/>
-              <w:left w:type="dxa" w:w="120"/>
-              <w:bottom w:type="dxa" w:w="80"/>
-              <w:right w:type="dxa" w:w="120"/>
-            </w:tcMar>
-            <w:vAlign w:val="center"/>
-          </w:tcPr>
-          <w:p>
-            <w:r>
-              <w:rPr>
-                <w:rFonts w:ascii="Arial" w:cs="Arial" w:eastAsia="Arial" w:hAnsi="Arial"/>
-                <w:b w:val="false"/>
-                <w:bCs w:val="false"/>
-                <w:color w:val="000000"/>
-                <w:sz w:val="18"/>
-                <w:szCs w:val="18"/>
-              </w:rPr>
-              <w:t xml:space="preserve">Five-stage pipeline with clear data flow. Architecture diagram provided separately (pipeline_architecture.html).</w:t>
-            </w:r>
-          </w:p>
-        </w:tc>
-      </w:tr>
-      <w:tr>
-        <w:tc>
-          <w:tcPr>
-            <w:tcBorders>
-              <w:top w:val="single" w:color="CCCCCC" w:sz="1"/>
-              <w:left w:val="single" w:color="CCCCCC" w:sz="1"/>
-              <w:bottom w:val="single" w:color="CCCCCC" w:sz="1"/>
-              <w:right w:val="single" w:color="CCCCCC" w:sz="1"/>
-            </w:tcBorders>
-            <w:tcMar>
-              <w:top w:type="dxa" w:w="80"/>
-              <w:left w:type="dxa" w:w="120"/>
-              <w:bottom w:type="dxa" w:w="80"/>
-              <w:right w:type="dxa" w:w="120"/>
-            </w:tcMar>
-            <w:vAlign w:val="center"/>
-          </w:tcPr>
-          <w:p>
-            <w:r>
-              <w:rPr>
-                <w:rFonts w:ascii="Arial" w:cs="Arial" w:eastAsia="Arial" w:hAnsi="Arial"/>
-                <w:b w:val="false"/>
-                <w:bCs w:val="false"/>
-                <w:color w:val="000000"/>
-                <w:sz w:val="18"/>
-                <w:szCs w:val="18"/>
-              </w:rPr>
-              <w:t xml:space="preserve">Data Integration</w:t>
-            </w:r>
-          </w:p>
-        </w:tc>
-        <w:tc>
-          <w:tcPr>
-            <w:tcBorders>
-              <w:top w:val="single" w:color="CCCCCC" w:sz="1"/>
-              <w:left w:val="single" w:color="CCCCCC" w:sz="1"/>
-              <w:bottom w:val="single" w:color="CCCCCC" w:sz="1"/>
-              <w:right w:val="single" w:color="CCCCCC" w:sz="1"/>
-            </w:tcBorders>
-            <w:tcMar>
-              <w:top w:type="dxa" w:w="80"/>
-              <w:left w:type="dxa" w:w="120"/>
-              <w:bottom w:type="dxa" w:w="80"/>
-              <w:right w:type="dxa" w:w="120"/>
-            </w:tcMar>
-            <w:vAlign w:val="center"/>
-          </w:tcPr>
-          <w:p>
-            <w:r>
-              <w:rPr>
-                <w:rFonts w:ascii="Arial" w:cs="Arial" w:eastAsia="Arial" w:hAnsi="Arial"/>
-                <w:b w:val="false"/>
-                <w:bCs w:val="false"/>
-                <w:color w:val="000000"/>
-                <w:sz w:val="18"/>
-                <w:szCs w:val="18"/>
-              </w:rPr>
-              <w:t xml:space="preserve">15%</w:t>
-            </w:r>
-          </w:p>
-        </w:tc>
-        <w:tc>
-          <w:tcPr>
-            <w:tcBorders>
-              <w:top w:val="single" w:color="CCCCCC" w:sz="1"/>
-              <w:left w:val="single" w:color="CCCCCC" w:sz="1"/>
-              <w:bottom w:val="single" w:color="CCCCCC" w:sz="1"/>
-              <w:right w:val="single" w:color="CCCCCC" w:sz="1"/>
-            </w:tcBorders>
-            <w:tcMar>
-              <w:top w:type="dxa" w:w="80"/>
-              <w:left w:type="dxa" w:w="120"/>
-              <w:bottom w:type="dxa" w:w="80"/>
-              <w:right w:type="dxa" w:w="120"/>
-            </w:tcMar>
-            <w:vAlign w:val="center"/>
-          </w:tcPr>
-          <w:p>
-            <w:r>
-              <w:rPr>
-                <w:rFonts w:ascii="Arial" w:cs="Arial" w:eastAsia="Arial" w:hAnsi="Arial"/>
-                <w:b w:val="false"/>
-                <w:bCs w:val="false"/>
-                <w:color w:val="000000"/>
-                <w:sz w:val="18"/>
-                <w:szCs w:val="18"/>
-              </w:rPr>
-              <w:t xml:space="preserve">515 incidents merged into final_integrated_report.csv with unified schema, severity scoring, and common ID format.</w:t>
-            </w:r>
-          </w:p>
-        </w:tc>
-      </w:tr>
-      <w:tr>
-        <w:tc>
-          <w:tcPr>
-            <w:tcBorders>
-              <w:top w:val="single" w:color="CCCCCC" w:sz="1"/>
-              <w:left w:val="single" w:color="CCCCCC" w:sz="1"/>
-              <w:bottom w:val="single" w:color="CCCCCC" w:sz="1"/>
-              <w:right w:val="single" w:color="CCCCCC" w:sz="1"/>
-            </w:tcBorders>
-            <w:tcMar>
-              <w:top w:type="dxa" w:w="80"/>
-              <w:left w:type="dxa" w:w="120"/>
-              <w:bottom w:type="dxa" w:w="80"/>
-              <w:right w:type="dxa" w:w="120"/>
-            </w:tcMar>
-            <w:vAlign w:val="center"/>
-          </w:tcPr>
-          <w:p>
-            <w:r>
-              <w:rPr>
-                <w:rFonts w:ascii="Arial" w:cs="Arial" w:eastAsia="Arial" w:hAnsi="Arial"/>
-                <w:b w:val="false"/>
-                <w:bCs w:val="false"/>
-                <w:color w:val="000000"/>
-                <w:sz w:val="18"/>
-                <w:szCs w:val="18"/>
-              </w:rPr>
-              <w:t xml:space="preserve">Code Quality</w:t>
-            </w:r>
-          </w:p>
-        </w:tc>
-        <w:tc>
-          <w:tcPr>
-            <w:tcBorders>
-              <w:top w:val="single" w:color="CCCCCC" w:sz="1"/>
-              <w:left w:val="single" w:color="CCCCCC" w:sz="1"/>
-              <w:bottom w:val="single" w:color="CCCCCC" w:sz="1"/>
-              <w:right w:val="single" w:color="CCCCCC" w:sz="1"/>
-            </w:tcBorders>
-            <w:tcMar>
-              <w:top w:type="dxa" w:w="80"/>
-              <w:left w:type="dxa" w:w="120"/>
-              <w:bottom w:type="dxa" w:w="80"/>
-              <w:right w:type="dxa" w:w="120"/>
-            </w:tcMar>
-            <w:vAlign w:val="center"/>
-          </w:tcPr>
-          <w:p>
-            <w:r>
-              <w:rPr>
-                <w:rFonts w:ascii="Arial" w:cs="Arial" w:eastAsia="Arial" w:hAnsi="Arial"/>
-                <w:b w:val="false"/>
-                <w:bCs w:val="false"/>
-                <w:color w:val="000000"/>
-                <w:sz w:val="18"/>
-                <w:szCs w:val="18"/>
-              </w:rPr>
-              <w:t xml:space="preserve">10%</w:t>
-            </w:r>
-          </w:p>
-        </w:tc>
-        <w:tc>
-          <w:tcPr>
-            <w:tcBorders>
-              <w:top w:val="single" w:color="CCCCCC" w:sz="1"/>
-              <w:left w:val="single" w:color="CCCCCC" w:sz="1"/>
-              <w:bottom w:val="single" w:color="CCCCCC" w:sz="1"/>
-              <w:right w:val="single" w:color="CCCCCC" w:sz="1"/>
-            </w:tcBorders>
-            <w:tcMar>
-              <w:top w:type="dxa" w:w="80"/>
-              <w:left w:type="dxa" w:w="120"/>
-              <w:bottom w:type="dxa" w:w="80"/>
-              <w:right w:type="dxa" w:w="120"/>
-            </w:tcMar>
-            <w:vAlign w:val="center"/>
-          </w:tcPr>
-          <w:p>
-            <w:r>
-              <w:rPr>
-                <w:rFonts w:ascii="Arial" w:cs="Arial" w:eastAsia="Arial" w:hAnsi="Arial"/>
-                <w:b w:val="false"/>
-                <w:bCs w:val="false"/>
-                <w:color w:val="000000"/>
-                <w:sz w:val="18"/>
-                <w:szCs w:val="18"/>
-              </w:rPr>
-              <w:t xml:space="preserve">GitHub repo with structured folders (/modules, /data, /outputs, /dashboard), requirements.txt, README, and inline comments.</w:t>
-            </w:r>
-          </w:p>
-        </w:tc>
-      </w:tr>
-      <w:tr>
-        <w:tc>
-          <w:tcPr>
-            <w:tcBorders>
-              <w:top w:val="single" w:color="CCCCCC" w:sz="1"/>
-              <w:left w:val="single" w:color="CCCCCC" w:sz="1"/>
-              <w:bottom w:val="single" w:color="CCCCCC" w:sz="1"/>
-              <w:right w:val="single" w:color="CCCCCC" w:sz="1"/>
-            </w:tcBorders>
-            <w:tcMar>
-              <w:top w:type="dxa" w:w="80"/>
-              <w:left w:type="dxa" w:w="120"/>
-              <w:bottom w:type="dxa" w:w="80"/>
-              <w:right w:type="dxa" w:w="120"/>
-            </w:tcMar>
-            <w:vAlign w:val="center"/>
-          </w:tcPr>
-          <w:p>
-            <w:r>
-              <w:rPr>
-                <w:rFonts w:ascii="Arial" w:cs="Arial" w:eastAsia="Arial" w:hAnsi="Arial"/>
-                <w:b w:val="false"/>
-                <w:bCs w:val="false"/>
-                <w:color w:val="000000"/>
-                <w:sz w:val="18"/>
-                <w:szCs w:val="18"/>
-              </w:rPr>
-              <w:t xml:space="preserve">Final Demonstration</w:t>
-            </w:r>
-          </w:p>
-        </w:tc>
-        <w:tc>
-          <w:tcPr>
-            <w:tcBorders>
-              <w:top w:val="single" w:color="CCCCCC" w:sz="1"/>
-              <w:left w:val="single" w:color="CCCCCC" w:sz="1"/>
-              <w:bottom w:val="single" w:color="CCCCCC" w:sz="1"/>
-              <w:right w:val="single" w:color="CCCCCC" w:sz="1"/>
-            </w:tcBorders>
-            <w:tcMar>
-              <w:top w:type="dxa" w:w="80"/>
-              <w:left w:type="dxa" w:w="120"/>
-              <w:bottom w:type="dxa" w:w="80"/>
-              <w:right w:type="dxa" w:w="120"/>
-            </w:tcMar>
-            <w:vAlign w:val="center"/>
-          </w:tcPr>
-          <w:p>
-            <w:r>
-              <w:rPr>
-                <w:rFonts w:ascii="Arial" w:cs="Arial" w:eastAsia="Arial" w:hAnsi="Arial"/>
-                <w:b w:val="false"/>
-                <w:bCs w:val="false"/>
-                <w:color w:val="000000"/>
-                <w:sz w:val="18"/>
-                <w:szCs w:val="18"/>
-              </w:rPr>
-              <w:t xml:space="preserve">10%</w:t>
-            </w:r>
-          </w:p>
-        </w:tc>
-        <w:tc>
-          <w:tcPr>
-            <w:tcBorders>
-              <w:top w:val="single" w:color="CCCCCC" w:sz="1"/>
-              <w:left w:val="single" w:color="CCCCCC" w:sz="1"/>
-              <w:bottom w:val="single" w:color="CCCCCC" w:sz="1"/>
-              <w:right w:val="single" w:color="CCCCCC" w:sz="1"/>
-            </w:tcBorders>
-            <w:tcMar>
-              <w:top w:type="dxa" w:w="80"/>
-              <w:left w:type="dxa" w:w="120"/>
-              <w:bottom w:type="dxa" w:w="80"/>
-              <w:right w:type="dxa" w:w="120"/>
-            </w:tcMar>
-            <w:vAlign w:val="center"/>
-          </w:tcPr>
-          <w:p>
-            <w:r>
-              <w:rPr>
-                <w:rFonts w:ascii="Arial" w:cs="Arial" w:eastAsia="Arial" w:hAnsi="Arial"/>
-                <w:b w:val="false"/>
-                <w:bCs w:val="false"/>
-                <w:color w:val="000000"/>
-                <w:sz w:val="18"/>
-                <w:szCs w:val="18"/>
-              </w:rPr>
-              <w:t xml:space="preserve">React dashboard with live filtering, search, charts, and incident detail modals demonstrates the full pipeline visually.</w:t>
-            </w:r>
-          </w:p>
-        </w:tc>
-      </w:tr>
-    </w:tbl>
-    <w:p>
-      <w:pPr>
-        <w:spacing w:after="120"/>
-      </w:pPr>
-    </w:p>
-    <w:p>
-      <w:pPr>
-        <w:pStyle w:val="Heading1"/>
-        <w:spacing w:after="160" w:before="320"/>
-      </w:pPr>
-      <w:r>
-        <w:rPr>
-          <w:rFonts w:ascii="Arial" w:cs="Arial" w:eastAsia="Arial" w:hAnsi="Arial"/>
-          <w:b/>
-          <w:bCs/>
-          <w:color w:val="1E3A5F"/>
-          <w:sz w:val="28"/>
-          <w:szCs w:val="28"/>
-        </w:rPr>
-        <w:t xml:space="preserve">9. Repository Structure</w:t>
-      </w:r>
-    </w:p>
-    <w:p>
-      <w:pPr>
-        <w:spacing w:after="120"/>
-      </w:pPr>
-    </w:p>
-    <w:p>
-      <w:pPr>
-        <w:spacing w:after="120"/>
-      </w:pPr>
-      <w:r>
-        <w:rPr>
-          <w:rFonts w:ascii="Courier New" w:cs="Courier New" w:eastAsia="Courier New" w:hAnsi="Courier New"/>
-          <w:color w:val="1a1a1a"/>
-          <w:sz w:val="18"/>
-          <w:szCs w:val="18"/>
-        </w:rPr>
-        <w:t xml:space="preserve">AI for engineers assignment 3/
-  ├── main.py                        → Full pipeline orchestrator
-  ├── sync_dashboard_data.py         → Sync CSVs to dashboard JS
-  ├── requirements.txt
-  ├── modules/
-  │   ├── audio_analyst.py
-  │   ├── document_analyst.py
-  │   ├── image_analyst.py
-  │   ├── video_analyst.py
-  │   ├── text_analyst.py
-  │   └── integrator.py
-  ├── data/
-  │   ├── audio/  (5 MP3 + transcripts.csv)
-  │   ├── documents/  (LESO2.pdf)
-  │   ├── videos/  (12 CAVIAR .mpg files)
-  │   └── Text/CrimeReport.txt
-  ├── outputs/
-  │   ├── audio_output.csv
-  │   ├── document_output.csv
-  │   ├── image_output.csv
-  │   ├── video_output.csv
-  │   ├── text_output.csv
-  │   └── final_integrated_report.csv
-  └── dashboard/  (React + Vite + Tailwind + Recharts)</w:t>
-      </w:r>
-    </w:p>
-    <w:p>
-      <w:pPr>
-        <w:spacing w:after="120"/>
-      </w:pPr>
-    </w:p>
-    <w:p>
-      <w:pPr>
-        <w:pStyle w:val="Heading1"/>
-        <w:spacing w:after="160" w:before="320"/>
-      </w:pPr>
-      <w:r>
-        <w:rPr>
-          <w:rFonts w:ascii="Arial" w:cs="Arial" w:eastAsia="Arial" w:hAnsi="Arial"/>
-          <w:b/>
-          <w:bCs/>
-          <w:color w:val="1E3A5F"/>
-          <w:sz w:val="28"/>
-          <w:szCs w:val="28"/>
-        </w:rPr>
-        <w:t xml:space="preserve">10. How to Run</w:t>
-      </w:r>
-    </w:p>
-    <w:p>
-      <w:pPr>
-        <w:pStyle w:val="Heading2"/>
-        <w:spacing w:after="100" w:before="240"/>
-      </w:pPr>
-      <w:r>
-        <w:rPr>
-          <w:rFonts w:ascii="Arial" w:cs="Arial" w:eastAsia="Arial" w:hAnsi="Arial"/>
-          <w:b/>
-          <w:bCs/>
-          <w:color w:val="2563EB"/>
-          <w:sz w:val="24"/>
-          <w:szCs w:val="24"/>
-        </w:rPr>
-        <w:t xml:space="preserve">Install Dependencies</w:t>
-      </w:r>
-    </w:p>
-    <w:p>
-      <w:pPr>
-        <w:spacing w:after="120"/>
-      </w:pPr>
-      <w:r>
-        <w:rPr>
-          <w:rFonts w:ascii="Courier New" w:cs="Courier New" w:eastAsia="Courier New" w:hAnsi="Courier New"/>
-          <w:color w:val="1a1a1a"/>
-          <w:sz w:val="18"/>
-          <w:szCs w:val="18"/>
-        </w:rPr>
-        <w:t xml:space="preserve">pip install openai-whisper roboflow ultralytics opencv-python pytesseract Pillow pandas spacy transformers torch nltk gTTS pdfplumber pymupdf reportlab requests
-python -m spacy download en_core_web_sm
-python -m nltk.downloader stopwords punkt
-brew install tesseract ffmpeg</w:t>
-      </w:r>
-    </w:p>
-    <w:p>
-      <w:pPr>
-        <w:pStyle w:val="Heading2"/>
-        <w:spacing w:after="100" w:before="240"/>
-      </w:pPr>
-      <w:r>
-        <w:rPr>
-          <w:rFonts w:ascii="Arial" w:cs="Arial" w:eastAsia="Arial" w:hAnsi="Arial"/>
-          <w:b/>
-          <w:bCs/>
-          <w:color w:val="2563EB"/>
-          <w:sz w:val="24"/>
-          <w:szCs w:val="24"/>
-        </w:rPr>
-        <w:t xml:space="preserve">Run Full Pipeline</w:t>
-      </w:r>
-    </w:p>
-    <w:p>
-      <w:pPr>
-        <w:spacing w:after="120"/>
-      </w:pPr>
-      <w:r>
-        <w:rPr>
-          <w:rFonts w:ascii="Courier New" w:cs="Courier New" w:eastAsia="Courier New" w:hAnsi="Courier New"/>
-          <w:color w:val="1a1a1a"/>
-          <w:sz w:val="18"/>
-          <w:szCs w:val="18"/>
-        </w:rPr>
-        <w:t xml:space="preserve">python main.py
-python sync_dashboard_data.py
-cd dashboard &amp;&amp; npm run dev</w:t>
-      </w:r>
     </w:p>
     <w:sectPr>
       <w:headerReference w:type="default" r:id="rId7"/>

</xml_diff>